<commit_message>
[L3-Agent] Update '(end of document)' in OmniBridge_High_Level_Document.docx — demo-user
</commit_message>
<xml_diff>
--- a/OmniBridgeDocs/OmniBridge_High_Level_Document.docx
+++ b/OmniBridgeDocs/OmniBridge_High_Level_Document.docx
@@ -1821,6 +1821,11 @@
           <w:szCs w:val="21"/>
         </w:rPr>
         <w:t xml:space="preserve">MongoDB is used as an operational/cache store, not as the system of record for master data — the MDM Hub retains that role.</w:t>
+      </w:r>
+    </w:p>
+    <w:p>
+      <w:r>
+        <w:t>This is a text append data abc xyz</w:t>
       </w:r>
     </w:p>
     <w:sectPr>

</xml_diff>

<commit_message>
[L3-Agent] Update '10. Assumptions & Constraints' in OmniBridge_High_Level_Document.docx — demo-user
</commit_message>
<xml_diff>
--- a/OmniBridgeDocs/OmniBridge_High_Level_Document.docx
+++ b/OmniBridgeDocs/OmniBridge_High_Level_Document.docx
@@ -1826,6 +1826,11 @@
     <w:p>
       <w:r>
         <w:t>This is a text append data abc xyz</w:t>
+      </w:r>
+    </w:p>
+    <w:p>
+      <w:r>
+        <w:t>TEST NOTE: This line was appended via the L3 doc-edit feature to verify the append function is working correctly.</w:t>
       </w:r>
     </w:p>
     <w:sectPr>

</xml_diff>